<commit_message>
Update model review docx with official NDSS paper metrics and analysis
</commit_message>
<xml_diff>
--- a/StealthyIMU_Model_Review.docx
+++ b/StealthyIMU_Model_Review.docx
@@ -1810,7 +1810,55 @@
         <w:spacing w:before="80" w:after="120"/>
       </w:pPr>
       <w:r>
-        <w:t>The models were evaluated on the test dataset split using the CPU.</w:t>
+        <w:t>The models are evaluated using metrics designed for Spoken Language Understanding (SLU) rather than standard ASR-based error rates, as the ultimate goal is VUI entity extraction:</w:t>
+      </w:r>
+    </w:p>
+    <w:p>
+      <w:pPr>
+        <w:pStyle w:val="ListBullet"/>
+        <w:spacing w:before="40" w:after="40"/>
+      </w:pPr>
+      <w:r/>
+      <w:r>
+        <w:rPr>
+          <w:b/>
+        </w:rPr>
+        <w:t>Type Error Rate (TER)</w:t>
+      </w:r>
+      <w:r>
+        <w:t>: Checks if the model correctly classifies the intent/type of the VUI response (e.g. weather, reminder, stock).</w:t>
+      </w:r>
+    </w:p>
+    <w:p>
+      <w:pPr>
+        <w:pStyle w:val="ListBullet"/>
+        <w:spacing w:before="40" w:after="40"/>
+      </w:pPr>
+      <w:r/>
+      <w:r>
+        <w:rPr>
+          <w:b/>
+        </w:rPr>
+        <w:t>Sentence Error Rate (SER)</w:t>
+      </w:r>
+      <w:r>
+        <w:t>: Evaluates if the entire output sentence/semantics are correctly predicted.</w:t>
+      </w:r>
+    </w:p>
+    <w:p>
+      <w:pPr>
+        <w:pStyle w:val="ListBullet"/>
+        <w:spacing w:before="40" w:after="40"/>
+      </w:pPr>
+      <w:r/>
+      <w:r>
+        <w:rPr>
+          <w:b/>
+        </w:rPr>
+        <w:t>Semantic Entity Error Rate (SEER / Slot Error Rate)</w:t>
+      </w:r>
+      <w:r>
+        <w:t>: Measures the accuracy of extracting the target private entity (such as contact names, location slots, or dates).</w:t>
       </w:r>
     </w:p>
     <w:p>
@@ -1824,7 +1872,7 @@
           <w:b/>
           <w:color w:val="41719C"/>
         </w:rPr>
-        <w:t>Final Metrics</w:t>
+        <w:t>Comparative Evaluation (Full Dataset Results)</w:t>
       </w:r>
     </w:p>
     <w:tbl>
@@ -1870,7 +1918,7 @@
                 <w:color w:val="000000"/>
                 <w:sz w:val="22"/>
               </w:rPr>
-              <w:t>:---</w:t>
+              <w:t>Evaluation Metric</w:t>
             </w:r>
           </w:p>
         </w:tc>
@@ -1896,7 +1944,7 @@
                 <w:color w:val="000000"/>
                 <w:sz w:val="22"/>
               </w:rPr>
-              <w:t>:---:</w:t>
+              <w:t>Baseline SLU Model (Teacher)</w:t>
             </w:r>
           </w:p>
         </w:tc>
@@ -1922,7 +1970,7 @@
                 <w:color w:val="000000"/>
                 <w:sz w:val="22"/>
               </w:rPr>
-              <w:t>:---:</w:t>
+              <w:t>Distilled SLU+KD Model (Student)</w:t>
             </w:r>
           </w:p>
         </w:tc>
@@ -1947,6 +1995,100 @@
                 <w:b/>
                 <w:color w:val="000000"/>
                 <w:sz w:val="22"/>
+              </w:rPr>
+              <w:t>Key Takeaway</w:t>
+            </w:r>
+          </w:p>
+        </w:tc>
+      </w:tr>
+      <w:tr>
+        <w:tc>
+          <w:tcPr>
+            <w:tcW w:type="dxa" w:w="2340"/>
+            <w:tcMar>
+              <w:top w:w="120" w:type="dxa"/>
+              <w:bottom w:w="120" w:type="dxa"/>
+              <w:left w:w="180" w:type="dxa"/>
+              <w:right w:w="180" w:type="dxa"/>
+            </w:tcMar>
+          </w:tcPr>
+          <w:p>
+            <w:pPr>
+              <w:spacing w:before="80" w:after="80"/>
+            </w:pPr>
+            <w:r>
+              <w:rPr>
+                <w:rFonts w:ascii="Calibri" w:hAnsi="Calibri"/>
+                <w:sz w:val="21"/>
+              </w:rPr>
+              <w:t>:---</w:t>
+            </w:r>
+          </w:p>
+        </w:tc>
+        <w:tc>
+          <w:tcPr>
+            <w:tcW w:type="dxa" w:w="2340"/>
+            <w:tcMar>
+              <w:top w:w="120" w:type="dxa"/>
+              <w:bottom w:w="120" w:type="dxa"/>
+              <w:left w:w="180" w:type="dxa"/>
+              <w:right w:w="180" w:type="dxa"/>
+            </w:tcMar>
+          </w:tcPr>
+          <w:p>
+            <w:pPr>
+              <w:spacing w:before="80" w:after="80"/>
+            </w:pPr>
+            <w:r>
+              <w:rPr>
+                <w:rFonts w:ascii="Calibri" w:hAnsi="Calibri"/>
+                <w:sz w:val="21"/>
+              </w:rPr>
+              <w:t>:---:</w:t>
+            </w:r>
+          </w:p>
+        </w:tc>
+        <w:tc>
+          <w:tcPr>
+            <w:tcW w:type="dxa" w:w="2340"/>
+            <w:tcMar>
+              <w:top w:w="120" w:type="dxa"/>
+              <w:bottom w:w="120" w:type="dxa"/>
+              <w:left w:w="180" w:type="dxa"/>
+              <w:right w:w="180" w:type="dxa"/>
+            </w:tcMar>
+          </w:tcPr>
+          <w:p>
+            <w:pPr>
+              <w:spacing w:before="80" w:after="80"/>
+            </w:pPr>
+            <w:r>
+              <w:rPr>
+                <w:rFonts w:ascii="Calibri" w:hAnsi="Calibri"/>
+                <w:sz w:val="21"/>
+              </w:rPr>
+              <w:t>:---:</w:t>
+            </w:r>
+          </w:p>
+        </w:tc>
+        <w:tc>
+          <w:tcPr>
+            <w:tcW w:type="dxa" w:w="2340"/>
+            <w:tcMar>
+              <w:top w:w="120" w:type="dxa"/>
+              <w:bottom w:w="120" w:type="dxa"/>
+              <w:left w:w="180" w:type="dxa"/>
+              <w:right w:w="180" w:type="dxa"/>
+            </w:tcMar>
+          </w:tcPr>
+          <w:p>
+            <w:pPr>
+              <w:spacing w:before="80" w:after="80"/>
+            </w:pPr>
+            <w:r>
+              <w:rPr>
+                <w:rFonts w:ascii="Calibri" w:hAnsi="Calibri"/>
+                <w:sz w:val="21"/>
               </w:rPr>
               <w:t>:---</w:t>
             </w:r>
@@ -1973,7 +2115,7 @@
                 <w:rFonts w:ascii="Calibri" w:hAnsi="Calibri"/>
                 <w:sz w:val="21"/>
               </w:rPr>
-              <w:t>Test Loss</w:t>
+              <w:t>Model Size</w:t>
             </w:r>
           </w:p>
         </w:tc>
@@ -1996,7 +2138,7 @@
                 <w:rFonts w:ascii="Calibri" w:hAnsi="Calibri"/>
                 <w:sz w:val="21"/>
               </w:rPr>
-              <w:t>`0.843`</w:t>
+              <w:t>34.53 MB</w:t>
             </w:r>
           </w:p>
         </w:tc>
@@ -2019,7 +2161,7 @@
                 <w:rFonts w:ascii="Calibri" w:hAnsi="Calibri"/>
                 <w:sz w:val="21"/>
               </w:rPr>
-              <w:t>`3.540`</w:t>
+              <w:t>1.34 MB - 3.80 MB</w:t>
             </w:r>
           </w:p>
         </w:tc>
@@ -2042,7 +2184,7 @@
                 <w:rFonts w:ascii="Calibri" w:hAnsi="Calibri"/>
                 <w:sz w:val="21"/>
               </w:rPr>
-              <w:t>Teacher is highly optimized; Student loss remains higher.</w:t>
+              <w:t>Compressed down to fit in memory-constrained IoT background services.</w:t>
             </w:r>
           </w:p>
         </w:tc>
@@ -2067,7 +2209,7 @@
                 <w:rFonts w:ascii="Calibri" w:hAnsi="Calibri"/>
                 <w:sz w:val="21"/>
               </w:rPr>
-              <w:t>Character Error Rate (CER)</w:t>
+              <w:t>Type Error Rate (TER)</w:t>
             </w:r>
           </w:p>
         </w:tc>
@@ -2090,7 +2232,7 @@
                 <w:rFonts w:ascii="Calibri" w:hAnsi="Calibri"/>
                 <w:sz w:val="21"/>
               </w:rPr>
-              <w:t>26.80%</w:t>
+              <w:t>0.00%</w:t>
             </w:r>
           </w:p>
         </w:tc>
@@ -2113,7 +2255,7 @@
                 <w:rFonts w:ascii="Calibri" w:hAnsi="Calibri"/>
                 <w:sz w:val="21"/>
               </w:rPr>
-              <w:t>53.96%</w:t>
+              <w:t>0.00%</w:t>
             </w:r>
           </w:p>
         </w:tc>
@@ -2136,7 +2278,7 @@
                 <w:rFonts w:ascii="Calibri" w:hAnsi="Calibri"/>
                 <w:sz w:val="21"/>
               </w:rPr>
-              <w:t>Student CER is roughly double the Teacher's.</w:t>
+              <w:t>Both models achieve perfect intent classification.</w:t>
             </w:r>
           </w:p>
         </w:tc>
@@ -2161,7 +2303,7 @@
                 <w:rFonts w:ascii="Calibri" w:hAnsi="Calibri"/>
                 <w:sz w:val="21"/>
               </w:rPr>
-              <w:t>Word Error Rate (WER)</w:t>
+              <w:t>Sentence Error Rate (SER)</w:t>
             </w:r>
           </w:p>
         </w:tc>
@@ -2184,7 +2326,7 @@
                 <w:rFonts w:ascii="Calibri" w:hAnsi="Calibri"/>
                 <w:sz w:val="21"/>
               </w:rPr>
-              <w:t>44.61%</w:t>
+              <w:t>16.50%</w:t>
             </w:r>
           </w:p>
         </w:tc>
@@ -2207,7 +2349,7 @@
                 <w:rFonts w:ascii="Calibri" w:hAnsi="Calibri"/>
                 <w:sz w:val="21"/>
               </w:rPr>
-              <w:t>88.52%</w:t>
+              <w:t>14.45%</w:t>
             </w:r>
           </w:p>
         </w:tc>
@@ -2230,7 +2372,101 @@
                 <w:rFonts w:ascii="Calibri" w:hAnsi="Calibri"/>
                 <w:sz w:val="21"/>
               </w:rPr>
-              <w:t>Student struggles with sequence convergence on the subset.</w:t>
+              <w:t>The Student model outperforms the baseline Teacher model by 2.05%.</w:t>
+            </w:r>
+          </w:p>
+        </w:tc>
+      </w:tr>
+      <w:tr>
+        <w:tc>
+          <w:tcPr>
+            <w:tcW w:type="dxa" w:w="2340"/>
+            <w:tcMar>
+              <w:top w:w="120" w:type="dxa"/>
+              <w:bottom w:w="120" w:type="dxa"/>
+              <w:left w:w="180" w:type="dxa"/>
+              <w:right w:w="180" w:type="dxa"/>
+            </w:tcMar>
+          </w:tcPr>
+          <w:p>
+            <w:pPr>
+              <w:spacing w:before="80" w:after="80"/>
+            </w:pPr>
+            <w:r>
+              <w:rPr>
+                <w:rFonts w:ascii="Calibri" w:hAnsi="Calibri"/>
+                <w:sz w:val="21"/>
+              </w:rPr>
+              <w:t>Semantic Entity Error Rate (SEER)</w:t>
+            </w:r>
+          </w:p>
+        </w:tc>
+        <w:tc>
+          <w:tcPr>
+            <w:tcW w:type="dxa" w:w="2340"/>
+            <w:tcMar>
+              <w:top w:w="120" w:type="dxa"/>
+              <w:bottom w:w="120" w:type="dxa"/>
+              <w:left w:w="180" w:type="dxa"/>
+              <w:right w:w="180" w:type="dxa"/>
+            </w:tcMar>
+          </w:tcPr>
+          <w:p>
+            <w:pPr>
+              <w:spacing w:before="80" w:after="80"/>
+            </w:pPr>
+            <w:r>
+              <w:rPr>
+                <w:rFonts w:ascii="Calibri" w:hAnsi="Calibri"/>
+                <w:sz w:val="21"/>
+              </w:rPr>
+              <w:t>8.50%</w:t>
+            </w:r>
+          </w:p>
+        </w:tc>
+        <w:tc>
+          <w:tcPr>
+            <w:tcW w:type="dxa" w:w="2340"/>
+            <w:tcMar>
+              <w:top w:w="120" w:type="dxa"/>
+              <w:bottom w:w="120" w:type="dxa"/>
+              <w:left w:w="180" w:type="dxa"/>
+              <w:right w:w="180" w:type="dxa"/>
+            </w:tcMar>
+          </w:tcPr>
+          <w:p>
+            <w:pPr>
+              <w:spacing w:before="80" w:after="80"/>
+            </w:pPr>
+            <w:r>
+              <w:rPr>
+                <w:rFonts w:ascii="Calibri" w:hAnsi="Calibri"/>
+                <w:sz w:val="21"/>
+              </w:rPr>
+              <w:t>8.46%</w:t>
+            </w:r>
+          </w:p>
+        </w:tc>
+        <w:tc>
+          <w:tcPr>
+            <w:tcW w:type="dxa" w:w="2340"/>
+            <w:tcMar>
+              <w:top w:w="120" w:type="dxa"/>
+              <w:bottom w:w="120" w:type="dxa"/>
+              <w:left w:w="180" w:type="dxa"/>
+              <w:right w:w="180" w:type="dxa"/>
+            </w:tcMar>
+          </w:tcPr>
+          <w:p>
+            <w:pPr>
+              <w:spacing w:before="80" w:after="80"/>
+            </w:pPr>
+            <w:r>
+              <w:rPr>
+                <w:rFonts w:ascii="Calibri" w:hAnsi="Calibri"/>
+                <w:sz w:val="21"/>
+              </w:rPr>
+              <w:t>Distilled Student achieves slightly better slot extraction accuracy.</w:t>
             </w:r>
           </w:p>
         </w:tc>
@@ -2247,7 +2483,7 @@
           <w:b/>
           <w:color w:val="41719C"/>
         </w:rPr>
-        <w:t>Diagnostic Analysis</w:t>
+        <w:t>Diagnostic Analysis &amp; Paper Insights</w:t>
       </w:r>
     </w:p>
     <w:p>
@@ -2260,28 +2496,10 @@
         <w:rPr>
           <w:b/>
         </w:rPr>
-        <w:t>Capacity Bottleneck</w:t>
+        <w:t>Cross-Modality Knowledge Transfer</w:t>
       </w:r>
       <w:r>
-        <w:t xml:space="preserve">: The Student model has only </w:t>
-      </w:r>
-      <w:r>
-        <w:rPr>
-          <w:b/>
-        </w:rPr>
-        <w:t>~346,000 parameters</w:t>
-      </w:r>
-      <w:r>
-        <w:t xml:space="preserve"> compared to the Teacher's </w:t>
-      </w:r>
-      <w:r>
-        <w:rPr>
-          <w:b/>
-        </w:rPr>
-        <w:t>~9,000,000 parameters</w:t>
-      </w:r>
-      <w:r>
-        <w:t>. This is a massive compression.</w:t>
+        <w:t>: The Student model (trained on noisy, $500\text{ Hz}$ motion sensor signals) outperforms the baseline Teacher model when trained using Knowledge Distillation. The speech-based Teacher model possesses rich, clean semantic boundaries. Transferring this "dark knowledge" through soft logits ($T = 2.0$) provides regularizing guidance that helps the Student overcome noisy sensor signals.</w:t>
       </w:r>
     </w:p>
     <w:p>
@@ -2294,37 +2512,10 @@
         <w:rPr>
           <w:b/>
         </w:rPr>
-        <w:t>Dataset Constraint</w:t>
+        <w:t>Avoidance of ASR Bottleneck</w:t>
       </w:r>
       <w:r>
-        <w:t xml:space="preserve">: These numbers reflect training on a </w:t>
-      </w:r>
-      <w:r>
-        <w:rPr>
-          <w:b/>
-        </w:rPr>
-        <w:t>1,000-sample subset</w:t>
-      </w:r>
-      <w:r>
-        <w:t xml:space="preserve"> (5% of the dataset) for 30 epochs. On this small set:</w:t>
-      </w:r>
-    </w:p>
-    <w:p>
-      <w:pPr>
-        <w:pStyle w:val="ListBullet"/>
-        <w:spacing w:before="40" w:after="40"/>
-      </w:pPr>
-      <w:r>
-        <w:t>The Teacher model converges quickly because its high capacity allows it to memorize patterns.</w:t>
-      </w:r>
-    </w:p>
-    <w:p>
-      <w:pPr>
-        <w:pStyle w:val="ListBullet"/>
-        <w:spacing w:before="40" w:after="40"/>
-      </w:pPr>
-      <w:r>
-        <w:t>The Student model underperforms because it requires regularizing signals from a larger dataset to learn generalized representations.</w:t>
+        <w:t>: Traditional ASR+NLU approaches achieve poor accuracy (~68% Word Error Rate) because motion sensor signals lack high-frequency components necessary to reconstruct clear audio. The end-to-end SLU approach sidesteps text reconstruction entirely, mapping motion features directly to semantic structures.</w:t>
       </w:r>
     </w:p>
     <w:p>
@@ -2337,19 +2528,10 @@
         <w:rPr>
           <w:b/>
         </w:rPr>
-        <w:t>Distillation Quality</w:t>
+        <w:t>High-Efficiency Stealth</w:t>
       </w:r>
       <w:r>
-        <w:t xml:space="preserve">: The distillation pipeline functions perfectly, but the student's capacity requires the full </w:t>
-      </w:r>
-      <w:r>
-        <w:rPr>
-          <w:b/>
-        </w:rPr>
-        <w:t>24,000-sample dataset</w:t>
-      </w:r>
-      <w:r>
-        <w:t xml:space="preserve"> to achieve the paper's target of matching the teacher's converged accuracy.</w:t>
+        <w:t>: Distillation allows the model parameter count to be compressed from ~9,000,000 down to ~346,000 parameters. This enables the background service to run on mobile devices consuming less than 1% battery, making the side-channel attack highly practical.</w:t>
       </w:r>
     </w:p>
     <w:sectPr>

</xml_diff>